<commit_message>
Segunda corrida Alcance Tecnico Landing (Word)
</commit_message>
<xml_diff>
--- a/descargables/Alcance-Tecnico-Landing-Meta-Ads.docx
+++ b/descargables/Alcance-Tecnico-Landing-Meta-Ads.docx
@@ -3,69 +3,275 @@
 <w:document xmlns:wpc="http://schemas.microsoft.com/office/word/2010/wordprocessingCanvas" xmlns:mo="http://schemas.microsoft.com/office/mac/office/2008/main" xmlns:mc="http://schemas.openxmlformats.org/markup-compatibility/2006" xmlns:mv="urn:schemas-microsoft-com:mac:vml" xmlns:o="urn:schemas-microsoft-com:office:office" xmlns:r="http://schemas.openxmlformats.org/officeDocument/2006/relationships" xmlns:m="http://schemas.openxmlformats.org/officeDocument/2006/math" xmlns:v="urn:schemas-microsoft-com:vml" xmlns:wp14="http://schemas.microsoft.com/office/word/2010/wordprocessingDrawing" xmlns:wp="http://schemas.openxmlformats.org/drawingml/2006/wordprocessingDrawing" xmlns:w10="urn:schemas-microsoft-com:office:word" xmlns:w="http://schemas.openxmlformats.org/wordprocessingml/2006/main" xmlns:w14="http://schemas.microsoft.com/office/word/2010/wordml" xmlns:wpg="http://schemas.microsoft.com/office/word/2010/wordprocessingGroup" xmlns:wpi="http://schemas.microsoft.com/office/word/2010/wordprocessingInk" xmlns:wne="http://schemas.microsoft.com/office/word/2006/wordml" xmlns:wps="http://schemas.microsoft.com/office/word/2010/wordprocessingShape" mc:Ignorable="w14 wp14">
   <w:body>
     <w:p>
+      <w:pPr>
+        <w:pStyle w:val="Title"/>
+      </w:pPr>
       <w:r>
-        <w:rPr>
-          <w:b/>
-          <w:color w:val="2C3A63"/>
-          <w:sz w:val="44"/>
-        </w:rPr>
         <w:t>Alcance Técnico — Landing Page y Meta Ads</w:t>
       </w:r>
     </w:p>
     <w:p>
       <w:r>
         <w:rPr>
-          <w:color w:val="55594C"/>
-          <w:sz w:val="20"/>
+          <w:b/>
         </w:rPr>
-        <w:t>Sitio: defensordelcontribuyente.cl</w:t>
+        <w:t xml:space="preserve">Sitio: </w:t>
+      </w:r>
+      <w:r>
+        <w:t>defensordelcontribuyente.cl</w:t>
+        <w:br/>
+      </w:r>
+      <w:r>
+        <w:rPr>
+          <w:b/>
+        </w:rPr>
+        <w:t xml:space="preserve">Fecha: </w:t>
+      </w:r>
+      <w:r>
+        <w:t>19 de agosto de 2026 (segunda corrida, complementada con datos reales de GA4)</w:t>
+        <w:br/>
+      </w:r>
+      <w:r>
+        <w:rPr>
+          <w:b/>
+        </w:rPr>
+        <w:t xml:space="preserve">Preparado para: </w:t>
+      </w:r>
+      <w:r>
+        <w:t>equipo de marketing entrante</w:t>
       </w:r>
     </w:p>
     <w:p>
+      <w:pPr>
+        <w:pStyle w:val="Heading1"/>
+      </w:pPr>
       <w:r>
-        <w:rPr>
-          <w:color w:val="55594C"/>
-          <w:sz w:val="20"/>
-        </w:rPr>
-        <w:t>Fecha: 17 de agosto de 2026</w:t>
-      </w:r>
-    </w:p>
-    <w:p>
-      <w:r>
-        <w:rPr>
-          <w:color w:val="55594C"/>
-          <w:sz w:val="20"/>
-        </w:rPr>
-        <w:t>Preparado para: equipo de marketing entrante</w:t>
-      </w:r>
-    </w:p>
-    <w:p/>
-    <w:p>
-      <w:r>
-        <w:rPr>
-          <w:b/>
-          <w:color w:val="2C3A63"/>
-          <w:sz w:val="28"/>
-        </w:rPr>
         <w:t>Resumen del alcance</w:t>
       </w:r>
     </w:p>
     <w:p>
       <w:r>
-        <w:rPr>
-          <w:color w:val="1A1E17"/>
-          <w:sz w:val="22"/>
-        </w:rPr>
-        <w:t>Este documento detalla las modificaciones requeridas en la landing page y la puesta a punto necesaria antes de operar campañas en Meta Ads, ordenadas por prioridad.</w:t>
+        <w:t>Este documento detalla las modificaciones requeridas en la landing page y la puesta a punto necesaria antes de operar campañas en Meta Ads, ordenadas por prioridad. Esta versión incorpora datos reales de comportamiento obtenidos vía el MCP oficial de Google Analytics.</w:t>
       </w:r>
     </w:p>
     <w:p>
+      <w:pPr>
+        <w:pStyle w:val="Heading1"/>
+      </w:pPr>
       <w:r>
-        <w:rPr>
-          <w:b/>
-          <w:color w:val="2C3A63"/>
-          <w:sz w:val="28"/>
-        </w:rPr>
+        <w:t>Datos reales de conversión (nuevo — vía GA4, últimos 30 días)</w:t>
+      </w:r>
+    </w:p>
+    <w:tbl>
+      <w:tblPr>
+        <w:tblStyle w:val="LightGrid-Accent1"/>
+        <w:tblW w:type="auto" w:w="0"/>
+        <w:tblLook w:firstColumn="1" w:firstRow="1" w:lastColumn="0" w:lastRow="0" w:noHBand="0" w:noVBand="1" w:val="04A0"/>
+      </w:tblPr>
+      <w:tblGrid>
+        <w:gridCol w:w="2160"/>
+        <w:gridCol w:w="2160"/>
+        <w:gridCol w:w="2160"/>
+        <w:gridCol w:w="2160"/>
+      </w:tblGrid>
+      <w:tr>
+        <w:tc>
+          <w:tcPr>
+            <w:tcW w:type="dxa" w:w="2160"/>
+          </w:tcPr>
+          <w:p>
+            <w:r>
+              <w:t>Canal</w:t>
+            </w:r>
+          </w:p>
+        </w:tc>
+        <w:tc>
+          <w:tcPr>
+            <w:tcW w:type="dxa" w:w="2160"/>
+          </w:tcPr>
+          <w:p>
+            <w:r>
+              <w:t>Sesiones</w:t>
+            </w:r>
+          </w:p>
+        </w:tc>
+        <w:tc>
+          <w:tcPr>
+            <w:tcW w:type="dxa" w:w="2160"/>
+          </w:tcPr>
+          <w:p>
+            <w:r>
+              <w:t>Tasa de rebote</w:t>
+            </w:r>
+          </w:p>
+        </w:tc>
+        <w:tc>
+          <w:tcPr>
+            <w:tcW w:type="dxa" w:w="2160"/>
+          </w:tcPr>
+          <w:p>
+            <w:r>
+              <w:t>Duración media</w:t>
+            </w:r>
+          </w:p>
+        </w:tc>
+      </w:tr>
+      <w:tr>
+        <w:tc>
+          <w:tcPr>
+            <w:tcW w:type="dxa" w:w="2160"/>
+          </w:tcPr>
+          <w:p>
+            <w:r>
+              <w:t>Paid Search</w:t>
+            </w:r>
+          </w:p>
+        </w:tc>
+        <w:tc>
+          <w:tcPr>
+            <w:tcW w:type="dxa" w:w="2160"/>
+          </w:tcPr>
+          <w:p>
+            <w:r>
+              <w:t>1.221</w:t>
+            </w:r>
+          </w:p>
+        </w:tc>
+        <w:tc>
+          <w:tcPr>
+            <w:tcW w:type="dxa" w:w="2160"/>
+          </w:tcPr>
+          <w:p>
+            <w:r>
+              <w:t>45.4%</w:t>
+            </w:r>
+          </w:p>
+        </w:tc>
+        <w:tc>
+          <w:tcPr>
+            <w:tcW w:type="dxa" w:w="2160"/>
+          </w:tcPr>
+          <w:p>
+            <w:r>
+              <w:t>128s</w:t>
+            </w:r>
+          </w:p>
+        </w:tc>
+      </w:tr>
+      <w:tr>
+        <w:tc>
+          <w:tcPr>
+            <w:tcW w:type="dxa" w:w="2160"/>
+          </w:tcPr>
+          <w:p>
+            <w:r>
+              <w:t>Organic Search</w:t>
+            </w:r>
+          </w:p>
+        </w:tc>
+        <w:tc>
+          <w:tcPr>
+            <w:tcW w:type="dxa" w:w="2160"/>
+          </w:tcPr>
+          <w:p>
+            <w:r>
+              <w:t>536</w:t>
+            </w:r>
+          </w:p>
+        </w:tc>
+        <w:tc>
+          <w:tcPr>
+            <w:tcW w:type="dxa" w:w="2160"/>
+          </w:tcPr>
+          <w:p>
+            <w:r>
+              <w:t>42.4%</w:t>
+            </w:r>
+          </w:p>
+        </w:tc>
+        <w:tc>
+          <w:tcPr>
+            <w:tcW w:type="dxa" w:w="2160"/>
+          </w:tcPr>
+          <w:p>
+            <w:r>
+              <w:t>173s</w:t>
+            </w:r>
+          </w:p>
+        </w:tc>
+      </w:tr>
+      <w:tr>
+        <w:tc>
+          <w:tcPr>
+            <w:tcW w:type="dxa" w:w="2160"/>
+          </w:tcPr>
+          <w:p>
+            <w:r>
+              <w:t>Direct</w:t>
+            </w:r>
+          </w:p>
+        </w:tc>
+        <w:tc>
+          <w:tcPr>
+            <w:tcW w:type="dxa" w:w="2160"/>
+          </w:tcPr>
+          <w:p>
+            <w:r>
+              <w:t>197</w:t>
+            </w:r>
+          </w:p>
+        </w:tc>
+        <w:tc>
+          <w:tcPr>
+            <w:tcW w:type="dxa" w:w="2160"/>
+          </w:tcPr>
+          <w:p>
+            <w:r>
+              <w:t>72.1%</w:t>
+            </w:r>
+          </w:p>
+        </w:tc>
+        <w:tc>
+          <w:tcPr>
+            <w:tcW w:type="dxa" w:w="2160"/>
+          </w:tcPr>
+          <w:p>
+            <w:r>
+              <w:t>97s</w:t>
+            </w:r>
+          </w:p>
+        </w:tc>
+      </w:tr>
+    </w:tbl>
+    <w:p>
+      <w:pPr>
+        <w:pStyle w:val="ListBullet"/>
+      </w:pPr>
+      <w:r>
+        <w:t>El tráfico Direct tiene casi el doble de rebote que Paid Search (72% vs 45%).</w:t>
+      </w:r>
+    </w:p>
+    <w:p>
+      <w:pPr>
+        <w:pStyle w:val="ListBullet"/>
+      </w:pPr>
+      <w:r>
+        <w:t>Cobranza Fiscal (27 conversiones/mes) y Prescripción Tributaria (14/mes) sí convierten y se cuentan; Fiscalización Tributaria tiene 19 envíos reales pero 0 marcados como conversión (ver Backlog ClickUp GA4, tarea G1).</w:t>
+      </w:r>
+    </w:p>
+    <w:p>
+      <w:pPr>
+        <w:pStyle w:val="ListBullet"/>
+      </w:pPr>
+      <w:r>
+        <w:t>57% de quienes inician un formulario no lo terminan (141 form_start vs 61 form_submit completados en 30 días).</w:t>
+      </w:r>
+    </w:p>
+    <w:p>
+      <w:pPr>
+        <w:pStyle w:val="Heading1"/>
+      </w:pPr>
+      <w:r>
         <w:t>Prioridad 1 — Tracking y medición (crítico, bloqueante para pautar)</w:t>
       </w:r>
     </w:p>
@@ -74,11 +280,7 @@
         <w:pStyle w:val="ListBullet"/>
       </w:pPr>
       <w:r>
-        <w:rPr>
-          <w:color w:val="1A1E17"/>
-          <w:sz w:val="22"/>
-        </w:rPr>
-        <w:t>Instalar el Meta Pixel en la totalidad del sitio.</w:t>
+        <w:t>Instalar Meta Pixel en la totalidad del sitio — confirmado ausente.</w:t>
       </w:r>
     </w:p>
     <w:p>
@@ -86,11 +288,7 @@
         <w:pStyle w:val="ListBullet"/>
       </w:pPr>
       <w:r>
-        <w:rPr>
-          <w:color w:val="1A1E17"/>
-          <w:sz w:val="22"/>
-        </w:rPr>
-        <w:t>Configurar el evento Lead para que se dispare al enviar el formulario de consulta (y el de WhatsApp, si existe).</w:t>
+        <w:t>Configurar el evento Lead al enviar el formulario de consulta.</w:t>
       </w:r>
     </w:p>
     <w:p>
@@ -98,11 +296,7 @@
         <w:pStyle w:val="ListBullet"/>
       </w:pPr>
       <w:r>
-        <w:rPr>
-          <w:color w:val="1A1E17"/>
-          <w:sz w:val="22"/>
-        </w:rPr>
-        <w:t>Resolver la duplicidad de Google Tag Manager (ver Alcance Técnico — SEO, Prioridad 1).</w:t>
+        <w:t>Resolver la duplicidad de GTM (ver Alcance Técnico SEO, Prioridad 1).</w:t>
       </w:r>
     </w:p>
     <w:p>
@@ -110,20 +304,14 @@
         <w:pStyle w:val="ListBullet"/>
       </w:pPr>
       <w:r>
-        <w:rPr>
-          <w:color w:val="1A1E17"/>
-          <w:sz w:val="22"/>
-        </w:rPr>
-        <w:t>Confirmar el estado actual de la cuenta de Meta Business Manager: campañas activas, históricas, y auditorías previas si existieran.</w:t>
+        <w:t>Confirmar el estado actual de Meta Business Manager.</w:t>
       </w:r>
     </w:p>
     <w:p>
+      <w:pPr>
+        <w:pStyle w:val="Heading1"/>
+      </w:pPr>
       <w:r>
-        <w:rPr>
-          <w:b/>
-          <w:color w:val="2C3A63"/>
-          <w:sz w:val="28"/>
-        </w:rPr>
         <w:t>Prioridad 2 — Optimización de conversión (CRO)</w:t>
       </w:r>
     </w:p>
@@ -132,11 +320,7 @@
         <w:pStyle w:val="ListBullet"/>
       </w:pPr>
       <w:r>
-        <w:rPr>
-          <w:color w:val="1A1E17"/>
-          <w:sz w:val="22"/>
-        </w:rPr>
-        <w:t>Diseñar y probar una versión simplificada del formulario (nombre + teléfono) específica para tráfico frío proveniente de Meta.</w:t>
+        <w:t>Investigar el 57% de abandono de formulario (dato real GA4).</w:t>
       </w:r>
     </w:p>
     <w:p>
@@ -144,11 +328,7 @@
         <w:pStyle w:val="ListBullet"/>
       </w:pPr>
       <w:r>
-        <w:rPr>
-          <w:color w:val="1A1E17"/>
-          <w:sz w:val="22"/>
-        </w:rPr>
-        <w:t>Variar el texto del CTA entre las distintas secciones de la página en lugar de repetir el mismo texto.</w:t>
+        <w:t>Investigar por qué el tráfico Direct rebota un 72%.</w:t>
       </w:r>
     </w:p>
     <w:p>
@@ -156,20 +336,30 @@
         <w:pStyle w:val="ListBullet"/>
       </w:pPr>
       <w:r>
-        <w:rPr>
-          <w:color w:val="1A1E17"/>
-          <w:sz w:val="22"/>
-        </w:rPr>
-        <w:t>Reforzar la propuesta de valor específica (deuda con el SII/Tesorería) desde el primer bloque visible de la página.</w:t>
+        <w:t>Diseñar y probar formulario corto para tráfico frío de Meta.</w:t>
       </w:r>
     </w:p>
     <w:p>
+      <w:pPr>
+        <w:pStyle w:val="ListBullet"/>
+      </w:pPr>
       <w:r>
-        <w:rPr>
-          <w:b/>
-          <w:color w:val="2C3A63"/>
-          <w:sz w:val="28"/>
-        </w:rPr>
+        <w:t>Variar el CTA entre secciones.</w:t>
+      </w:r>
+    </w:p>
+    <w:p>
+      <w:pPr>
+        <w:pStyle w:val="ListBullet"/>
+      </w:pPr>
+      <w:r>
+        <w:t>Reforzar la propuesta de valor en el primer bloque visible.</w:t>
+      </w:r>
+    </w:p>
+    <w:p>
+      <w:pPr>
+        <w:pStyle w:val="Heading1"/>
+      </w:pPr>
+      <w:r>
         <w:t>Prioridad 3 — Prueba social</w:t>
       </w:r>
     </w:p>
@@ -178,20 +368,14 @@
         <w:pStyle w:val="ListBullet"/>
       </w:pPr>
       <w:r>
-        <w:rPr>
-          <w:color w:val="1A1E17"/>
-          <w:sz w:val="22"/>
-        </w:rPr>
-        <w:t>Incorporar prueba social numérica (casos resueltos, años de operación) en la home, complementando los testimonios en video ya existentes.</w:t>
+        <w:t>Incorporar prueba social numérica (casos resueltos, años de operación).</w:t>
       </w:r>
     </w:p>
     <w:p>
+      <w:pPr>
+        <w:pStyle w:val="Heading1"/>
+      </w:pPr>
       <w:r>
-        <w:rPr>
-          <w:b/>
-          <w:color w:val="2C3A63"/>
-          <w:sz w:val="28"/>
-        </w:rPr>
         <w:t>Prioridad 4 — Campañas</w:t>
       </w:r>
     </w:p>
@@ -200,11 +384,7 @@
         <w:pStyle w:val="ListBullet"/>
       </w:pPr>
       <w:r>
-        <w:rPr>
-          <w:color w:val="1A1E17"/>
-          <w:sz w:val="22"/>
-        </w:rPr>
-        <w:t>Publicar el set de anuncios del Anexo A (5 variantes con ángulos distintos) como primera tanda de testing.</w:t>
+        <w:t>Publicar el Anexo A (5 variantes) una vez resuelto el Meta Pixel.</w:t>
       </w:r>
     </w:p>
     <w:p>
@@ -212,645 +392,57 @@
         <w:pStyle w:val="ListBullet"/>
       </w:pPr>
       <w:r>
-        <w:rPr>
-          <w:color w:val="1A1E17"/>
-          <w:sz w:val="22"/>
-        </w:rPr>
-        <w:t>Reportar estructura de campañas, presupuesto y resultados de forma quincenal: CTR, CPC, ROAS y costo por lead, segmentado por campaña.</w:t>
+        <w:t>Reporte quincenal de campañas: CTR, CPC, ROAS, costo por lead.</w:t>
+      </w:r>
+    </w:p>
+    <w:p>
+      <w:pPr>
+        <w:pStyle w:val="Heading1"/>
+      </w:pPr>
+      <w:r>
+        <w:t>Anexo A</w:t>
       </w:r>
     </w:p>
     <w:p>
       <w:r>
-        <w:rPr>
-          <w:b/>
-          <w:color w:val="2C3A63"/>
-          <w:sz w:val="28"/>
-        </w:rPr>
-        <w:t>Anexo A — Anuncios listos para publicar</w:t>
-      </w:r>
-    </w:p>
-    <w:p>
-      <w:r>
-        <w:rPr>
-          <w:b/>
-          <w:color w:val="1A1E17"/>
-          <w:sz w:val="24"/>
-        </w:rPr>
-        <w:t>1. Ángulo resultado / testimonio</w:t>
+        <w:t>Sin cambios respecto a la línea base del 17-08-2026 — ver versión anterior del documento para el detalle de las 5 variantes de ángulo.</w:t>
       </w:r>
     </w:p>
     <w:p>
       <w:pPr>
-        <w:pStyle w:val="ListBullet"/>
+        <w:pStyle w:val="Heading1"/>
       </w:pPr>
       <w:r>
-        <w:rPr>
-          <w:color w:val="1A1E17"/>
-          <w:sz w:val="22"/>
-        </w:rPr>
-      </w:r>
-      <w:r>
-        <w:rPr>
-          <w:b/>
-          <w:color w:val="1A1E17"/>
-          <w:sz w:val="22"/>
-        </w:rPr>
-        <w:t>Hook:</w:t>
-      </w:r>
-      <w:r>
-        <w:rPr>
-          <w:color w:val="1A1E17"/>
-          <w:sz w:val="22"/>
-        </w:rPr>
-        <w:t xml:space="preserve"> "Eduardo pensó que el SII le iba a quitar la empresa. Hoy sigue funcionando."</w:t>
-      </w:r>
-    </w:p>
-    <w:p>
-      <w:pPr>
-        <w:pStyle w:val="ListBullet"/>
-      </w:pPr>
-      <w:r>
-        <w:rPr>
-          <w:color w:val="1A1E17"/>
-          <w:sz w:val="22"/>
-        </w:rPr>
-      </w:r>
-      <w:r>
-        <w:rPr>
-          <w:b/>
-          <w:color w:val="1A1E17"/>
-          <w:sz w:val="22"/>
-        </w:rPr>
-        <w:t>Copy:</w:t>
-      </w:r>
-      <w:r>
-        <w:rPr>
-          <w:color w:val="1A1E17"/>
-          <w:sz w:val="22"/>
-        </w:rPr>
-        <w:t xml:space="preserve"> Cuando la deuda con el SII empieza a crecer, el miedo no te deja pensar con claridad. Eduardo pasó por eso — y encontró una salida. Mira su historia y agenda tu diagnóstico gratuito.</w:t>
-      </w:r>
-    </w:p>
-    <w:p>
-      <w:pPr>
-        <w:pStyle w:val="ListBullet"/>
-      </w:pPr>
-      <w:r>
-        <w:rPr>
-          <w:color w:val="1A1E17"/>
-          <w:sz w:val="22"/>
-        </w:rPr>
-      </w:r>
-      <w:r>
-        <w:rPr>
-          <w:b/>
-          <w:color w:val="1A1E17"/>
-          <w:sz w:val="22"/>
-        </w:rPr>
-        <w:t>CTA:</w:t>
-      </w:r>
-      <w:r>
-        <w:rPr>
-          <w:color w:val="1A1E17"/>
-          <w:sz w:val="22"/>
-        </w:rPr>
-        <w:t xml:space="preserve"> Agendar diagnóstico gratuito</w:t>
-      </w:r>
-    </w:p>
-    <w:p>
-      <w:pPr>
-        <w:pStyle w:val="ListBullet"/>
-      </w:pPr>
-      <w:r>
-        <w:rPr>
-          <w:color w:val="1A1E17"/>
-          <w:sz w:val="22"/>
-        </w:rPr>
-      </w:r>
-      <w:r>
-        <w:rPr>
-          <w:b/>
-          <w:color w:val="1A1E17"/>
-          <w:sz w:val="22"/>
-        </w:rPr>
-        <w:t>Formato:</w:t>
-      </w:r>
-      <w:r>
-        <w:rPr>
-          <w:color w:val="1A1E17"/>
-          <w:sz w:val="22"/>
-        </w:rPr>
-        <w:t xml:space="preserve"> Video (testimonio existente, recortado a 30–45s)</w:t>
-      </w:r>
-    </w:p>
-    <w:p>
-      <w:r>
-        <w:rPr>
-          <w:b/>
-          <w:color w:val="1A1E17"/>
-          <w:sz w:val="24"/>
-        </w:rPr>
-        <w:t>2. Ángulo problema / urgencia</w:t>
-      </w:r>
-    </w:p>
-    <w:p>
-      <w:pPr>
-        <w:pStyle w:val="ListBullet"/>
-      </w:pPr>
-      <w:r>
-        <w:rPr>
-          <w:color w:val="1A1E17"/>
-          <w:sz w:val="22"/>
-        </w:rPr>
-      </w:r>
-      <w:r>
-        <w:rPr>
-          <w:b/>
-          <w:color w:val="1A1E17"/>
-          <w:sz w:val="22"/>
-        </w:rPr>
-        <w:t>Hook:</w:t>
-      </w:r>
-      <w:r>
-        <w:rPr>
-          <w:color w:val="1A1E17"/>
-          <w:sz w:val="22"/>
-        </w:rPr>
-        <w:t xml:space="preserve"> "Si te llegó una notificación del SII y la estás dejando pasar, cada día que espera cuesta más caro."</w:t>
-      </w:r>
-    </w:p>
-    <w:p>
-      <w:pPr>
-        <w:pStyle w:val="ListBullet"/>
-      </w:pPr>
-      <w:r>
-        <w:rPr>
-          <w:color w:val="1A1E17"/>
-          <w:sz w:val="22"/>
-        </w:rPr>
-      </w:r>
-      <w:r>
-        <w:rPr>
-          <w:b/>
-          <w:color w:val="1A1E17"/>
-          <w:sz w:val="22"/>
-        </w:rPr>
-        <w:t>Copy:</w:t>
-      </w:r>
-      <w:r>
-        <w:rPr>
-          <w:color w:val="1A1E17"/>
-          <w:sz w:val="22"/>
-        </w:rPr>
-        <w:t xml:space="preserve"> Una fiscalización o una deuda tributaria no se resuelve sola — y mientras más tiempo pasa, más intereses y multas se acumulan. Habla hoy con un equipo especializado en defensa del contribuyente.</w:t>
-      </w:r>
-    </w:p>
-    <w:p>
-      <w:pPr>
-        <w:pStyle w:val="ListBullet"/>
-      </w:pPr>
-      <w:r>
-        <w:rPr>
-          <w:color w:val="1A1E17"/>
-          <w:sz w:val="22"/>
-        </w:rPr>
-      </w:r>
-      <w:r>
-        <w:rPr>
-          <w:b/>
-          <w:color w:val="1A1E17"/>
-          <w:sz w:val="22"/>
-        </w:rPr>
-        <w:t>CTA:</w:t>
-      </w:r>
-      <w:r>
-        <w:rPr>
-          <w:color w:val="1A1E17"/>
-          <w:sz w:val="22"/>
-        </w:rPr>
-        <w:t xml:space="preserve"> Quiero mi diagnóstico gratuito</w:t>
-      </w:r>
-    </w:p>
-    <w:p>
-      <w:pPr>
-        <w:pStyle w:val="ListBullet"/>
-      </w:pPr>
-      <w:r>
-        <w:rPr>
-          <w:color w:val="1A1E17"/>
-          <w:sz w:val="22"/>
-        </w:rPr>
-      </w:r>
-      <w:r>
-        <w:rPr>
-          <w:b/>
-          <w:color w:val="1A1E17"/>
-          <w:sz w:val="22"/>
-        </w:rPr>
-        <w:t>Formato:</w:t>
-      </w:r>
-      <w:r>
-        <w:rPr>
-          <w:color w:val="1A1E17"/>
-          <w:sz w:val="22"/>
-        </w:rPr>
-        <w:t xml:space="preserve"> Imagen o carrusel</w:t>
-      </w:r>
-    </w:p>
-    <w:p>
-      <w:r>
-        <w:rPr>
-          <w:b/>
-          <w:color w:val="1A1E17"/>
-          <w:sz w:val="24"/>
-        </w:rPr>
-        <w:t>3. Ángulo prueba social</w:t>
-      </w:r>
-    </w:p>
-    <w:p>
-      <w:pPr>
-        <w:pStyle w:val="ListBullet"/>
-      </w:pPr>
-      <w:r>
-        <w:rPr>
-          <w:color w:val="1A1E17"/>
-          <w:sz w:val="22"/>
-        </w:rPr>
-      </w:r>
-      <w:r>
-        <w:rPr>
-          <w:b/>
-          <w:color w:val="1A1E17"/>
-          <w:sz w:val="22"/>
-        </w:rPr>
-        <w:t>Hook:</w:t>
-      </w:r>
-      <w:r>
-        <w:rPr>
-          <w:color w:val="1A1E17"/>
-          <w:sz w:val="22"/>
-        </w:rPr>
-        <w:t xml:space="preserve"> "[completar con el número real] pymes ya resolvieron su deuda con el SII con nosotros."</w:t>
-      </w:r>
-    </w:p>
-    <w:p>
-      <w:pPr>
-        <w:pStyle w:val="ListBullet"/>
-      </w:pPr>
-      <w:r>
-        <w:rPr>
-          <w:color w:val="1A1E17"/>
-          <w:sz w:val="22"/>
-        </w:rPr>
-      </w:r>
-      <w:r>
-        <w:rPr>
-          <w:b/>
-          <w:color w:val="1A1E17"/>
-          <w:sz w:val="22"/>
-        </w:rPr>
-        <w:t>Copy:</w:t>
-      </w:r>
-      <w:r>
-        <w:rPr>
-          <w:color w:val="1A1E17"/>
-          <w:sz w:val="22"/>
-        </w:rPr>
-        <w:t xml:space="preserve"> No estás solo enfrentando esto. Emprendedores de todo Chile han recuperado su tranquilidad financiera con Defensor del Contribuyente. Conoce cómo podemos ayudarte.</w:t>
-      </w:r>
-    </w:p>
-    <w:p>
-      <w:pPr>
-        <w:pStyle w:val="ListBullet"/>
-      </w:pPr>
-      <w:r>
-        <w:rPr>
-          <w:color w:val="1A1E17"/>
-          <w:sz w:val="22"/>
-        </w:rPr>
-      </w:r>
-      <w:r>
-        <w:rPr>
-          <w:b/>
-          <w:color w:val="1A1E17"/>
-          <w:sz w:val="22"/>
-        </w:rPr>
-        <w:t>CTA:</w:t>
-      </w:r>
-      <w:r>
-        <w:rPr>
-          <w:color w:val="1A1E17"/>
-          <w:sz w:val="22"/>
-        </w:rPr>
-        <w:t xml:space="preserve"> Ver cómo podemos ayudarte</w:t>
-      </w:r>
-    </w:p>
-    <w:p>
-      <w:pPr>
-        <w:pStyle w:val="ListBullet"/>
-      </w:pPr>
-      <w:r>
-        <w:rPr>
-          <w:color w:val="1A1E17"/>
-          <w:sz w:val="22"/>
-        </w:rPr>
-      </w:r>
-      <w:r>
-        <w:rPr>
-          <w:b/>
-          <w:color w:val="1A1E17"/>
-          <w:sz w:val="22"/>
-        </w:rPr>
-        <w:t>Formato:</w:t>
-      </w:r>
-      <w:r>
-        <w:rPr>
-          <w:color w:val="1A1E17"/>
-          <w:sz w:val="22"/>
-        </w:rPr>
-        <w:t xml:space="preserve"> Carrusel con 3–4 testimonios en video existentes. Uso sugerido: retargeting de visitantes del sitio.</w:t>
-      </w:r>
-    </w:p>
-    <w:p>
-      <w:r>
-        <w:rPr>
-          <w:b/>
-          <w:color w:val="1A1E17"/>
-          <w:sz w:val="24"/>
-        </w:rPr>
-        <w:t>4. Ángulo curiosidad</w:t>
-      </w:r>
-    </w:p>
-    <w:p>
-      <w:pPr>
-        <w:pStyle w:val="ListBullet"/>
-      </w:pPr>
-      <w:r>
-        <w:rPr>
-          <w:color w:val="1A1E17"/>
-          <w:sz w:val="22"/>
-        </w:rPr>
-      </w:r>
-      <w:r>
-        <w:rPr>
-          <w:b/>
-          <w:color w:val="1A1E17"/>
-          <w:sz w:val="22"/>
-        </w:rPr>
-        <w:t>Hook:</w:t>
-      </w:r>
-      <w:r>
-        <w:rPr>
-          <w:color w:val="1A1E17"/>
-          <w:sz w:val="22"/>
-        </w:rPr>
-        <w:t xml:space="preserve"> "La mayoría de las pymes no sabe que existe la prescripción tributaria. Puede que tu deuda ya no sea exigible."</w:t>
-      </w:r>
-    </w:p>
-    <w:p>
-      <w:pPr>
-        <w:pStyle w:val="ListBullet"/>
-      </w:pPr>
-      <w:r>
-        <w:rPr>
-          <w:color w:val="1A1E17"/>
-          <w:sz w:val="22"/>
-        </w:rPr>
-      </w:r>
-      <w:r>
-        <w:rPr>
-          <w:b/>
-          <w:color w:val="1A1E17"/>
-          <w:sz w:val="22"/>
-        </w:rPr>
-        <w:t>Copy:</w:t>
-      </w:r>
-      <w:r>
-        <w:rPr>
-          <w:color w:val="1A1E17"/>
-          <w:sz w:val="22"/>
-        </w:rPr>
-        <w:t xml:space="preserve"> Muchos contribuyentes pagan deudas que legalmente ya prescribieron, solo por desconocimiento. Revisa tu caso gratis con un abogado tributario.</w:t>
-      </w:r>
-    </w:p>
-    <w:p>
-      <w:pPr>
-        <w:pStyle w:val="ListBullet"/>
-      </w:pPr>
-      <w:r>
-        <w:rPr>
-          <w:color w:val="1A1E17"/>
-          <w:sz w:val="22"/>
-        </w:rPr>
-      </w:r>
-      <w:r>
-        <w:rPr>
-          <w:b/>
-          <w:color w:val="1A1E17"/>
-          <w:sz w:val="22"/>
-        </w:rPr>
-        <w:t>CTA:</w:t>
-      </w:r>
-      <w:r>
-        <w:rPr>
-          <w:color w:val="1A1E17"/>
-          <w:sz w:val="22"/>
-        </w:rPr>
-        <w:t xml:space="preserve"> Revisar mi caso</w:t>
-      </w:r>
-    </w:p>
-    <w:p>
-      <w:pPr>
-        <w:pStyle w:val="ListBullet"/>
-      </w:pPr>
-      <w:r>
-        <w:rPr>
-          <w:color w:val="1A1E17"/>
-          <w:sz w:val="22"/>
-        </w:rPr>
-      </w:r>
-      <w:r>
-        <w:rPr>
-          <w:b/>
-          <w:color w:val="1A1E17"/>
-          <w:sz w:val="22"/>
-        </w:rPr>
-        <w:t>Formato:</w:t>
-      </w:r>
-      <w:r>
-        <w:rPr>
-          <w:color w:val="1A1E17"/>
-          <w:sz w:val="22"/>
-        </w:rPr>
-        <w:t xml:space="preserve"> Imagen simple, texto grande</w:t>
-      </w:r>
-    </w:p>
-    <w:p>
-      <w:r>
-        <w:rPr>
-          <w:b/>
-          <w:color w:val="1A1E17"/>
-          <w:sz w:val="24"/>
-        </w:rPr>
-        <w:t>5. Ángulo contraste (antes/después)</w:t>
-      </w:r>
-    </w:p>
-    <w:p>
-      <w:pPr>
-        <w:pStyle w:val="ListBullet"/>
-      </w:pPr>
-      <w:r>
-        <w:rPr>
-          <w:color w:val="1A1E17"/>
-          <w:sz w:val="22"/>
-        </w:rPr>
-      </w:r>
-      <w:r>
-        <w:rPr>
-          <w:b/>
-          <w:color w:val="1A1E17"/>
-          <w:sz w:val="22"/>
-        </w:rPr>
-        <w:t>Hook:</w:t>
-      </w:r>
-      <w:r>
-        <w:rPr>
-          <w:color w:val="1A1E17"/>
-          <w:sz w:val="22"/>
-        </w:rPr>
-        <w:t xml:space="preserve"> "Antes: llamadas de Tesorería todos los meses. Ahora: un plan de pago que sí puede cumplir."</w:t>
-      </w:r>
-    </w:p>
-    <w:p>
-      <w:pPr>
-        <w:pStyle w:val="ListBullet"/>
-      </w:pPr>
-      <w:r>
-        <w:rPr>
-          <w:color w:val="1A1E17"/>
-          <w:sz w:val="22"/>
-        </w:rPr>
-      </w:r>
-      <w:r>
-        <w:rPr>
-          <w:b/>
-          <w:color w:val="1A1E17"/>
-          <w:sz w:val="22"/>
-        </w:rPr>
-        <w:t>Copy:</w:t>
-      </w:r>
-      <w:r>
-        <w:rPr>
-          <w:color w:val="1A1E17"/>
-          <w:sz w:val="22"/>
-        </w:rPr>
-        <w:t xml:space="preserve"> Convenios y condonaciones bien negociados cambian por completo la relación de una pyme con su deuda fiscal. Conversemos sobre tu situación, sin costo.</w:t>
-      </w:r>
-    </w:p>
-    <w:p>
-      <w:pPr>
-        <w:pStyle w:val="ListBullet"/>
-      </w:pPr>
-      <w:r>
-        <w:rPr>
-          <w:color w:val="1A1E17"/>
-          <w:sz w:val="22"/>
-        </w:rPr>
-      </w:r>
-      <w:r>
-        <w:rPr>
-          <w:b/>
-          <w:color w:val="1A1E17"/>
-          <w:sz w:val="22"/>
-        </w:rPr>
-        <w:t>CTA:</w:t>
-      </w:r>
-      <w:r>
-        <w:rPr>
-          <w:color w:val="1A1E17"/>
-          <w:sz w:val="22"/>
-        </w:rPr>
-        <w:t xml:space="preserve"> Conversar por WhatsApp</w:t>
-      </w:r>
-    </w:p>
-    <w:p>
-      <w:pPr>
-        <w:pStyle w:val="ListBullet"/>
-      </w:pPr>
-      <w:r>
-        <w:rPr>
-          <w:color w:val="1A1E17"/>
-          <w:sz w:val="22"/>
-        </w:rPr>
-      </w:r>
-      <w:r>
-        <w:rPr>
-          <w:b/>
-          <w:color w:val="1A1E17"/>
-          <w:sz w:val="22"/>
-        </w:rPr>
-        <w:t>Formato:</w:t>
-      </w:r>
-      <w:r>
-        <w:rPr>
-          <w:color w:val="1A1E17"/>
-          <w:sz w:val="22"/>
-        </w:rPr>
-        <w:t xml:space="preserve"> Imagen — destino WhatsApp, no el formulario largo</w:t>
-      </w:r>
-    </w:p>
-    <w:p>
-      <w:r>
-        <w:rPr>
-          <w:b/>
-          <w:color w:val="2C3A63"/>
-          <w:sz w:val="28"/>
-        </w:rPr>
         <w:t>Criterios de aceptación</w:t>
       </w:r>
     </w:p>
     <w:tbl>
       <w:tblPr>
-        <w:tblStyle w:val="TableGrid"/>
+        <w:tblStyle w:val="LightGrid-Accent1"/>
         <w:tblW w:type="auto" w:w="0"/>
-        <w:jc w:val="left"/>
         <w:tblLook w:firstColumn="1" w:firstRow="1" w:lastColumn="0" w:lastRow="0" w:noHBand="0" w:noVBand="1" w:val="04A0"/>
       </w:tblPr>
       <w:tblGrid>
-        <w:gridCol w:w="4873"/>
-        <w:gridCol w:w="4873"/>
+        <w:gridCol w:w="4320"/>
+        <w:gridCol w:w="4320"/>
       </w:tblGrid>
       <w:tr>
         <w:tc>
           <w:tcPr>
-            <w:tcW w:type="dxa" w:w="4873"/>
-            <w:shd w:fill="2C3A63"/>
+            <w:tcW w:type="dxa" w:w="4320"/>
           </w:tcPr>
           <w:p>
-            <w:r/>
             <w:r>
-              <w:rPr>
-                <w:b/>
-                <w:color w:val="FFFFFF"/>
-                <w:sz w:val="20"/>
-              </w:rPr>
               <w:t>Punto</w:t>
             </w:r>
           </w:p>
         </w:tc>
         <w:tc>
           <w:tcPr>
-            <w:tcW w:type="dxa" w:w="4873"/>
-            <w:shd w:fill="2C3A63"/>
+            <w:tcW w:type="dxa" w:w="4320"/>
           </w:tcPr>
           <w:p>
-            <w:r/>
             <w:r>
-              <w:rPr>
-                <w:b/>
-                <w:color w:val="FFFFFF"/>
-                <w:sz w:val="20"/>
-              </w:rPr>
               <w:t>Cómo se valida</w:t>
             </w:r>
           </w:p>
@@ -859,31 +451,21 @@
       <w:tr>
         <w:tc>
           <w:tcPr>
-            <w:tcW w:type="dxa" w:w="4873"/>
+            <w:tcW w:type="dxa" w:w="4320"/>
           </w:tcPr>
           <w:p>
-            <w:r/>
             <w:r>
-              <w:rPr>
-                <w:color w:val="1A1E17"/>
-                <w:sz w:val="20"/>
-              </w:rPr>
               <w:t>Meta Pixel activo</w:t>
             </w:r>
           </w:p>
         </w:tc>
         <w:tc>
           <w:tcPr>
-            <w:tcW w:type="dxa" w:w="4873"/>
+            <w:tcW w:type="dxa" w:w="4320"/>
           </w:tcPr>
           <w:p>
-            <w:r/>
             <w:r>
-              <w:rPr>
-                <w:color w:val="1A1E17"/>
-                <w:sz w:val="20"/>
-              </w:rPr>
-              <w:t>Evento visible en el Administrador de Eventos de Meta al probar el formulario</w:t>
+              <w:t>Evento visible en el Administrador de Eventos de Meta.</w:t>
             </w:r>
           </w:p>
         </w:tc>
@@ -891,31 +473,21 @@
       <w:tr>
         <w:tc>
           <w:tcPr>
-            <w:tcW w:type="dxa" w:w="4873"/>
+            <w:tcW w:type="dxa" w:w="4320"/>
           </w:tcPr>
           <w:p>
-            <w:r/>
             <w:r>
-              <w:rPr>
-                <w:color w:val="1A1E17"/>
-                <w:sz w:val="20"/>
-              </w:rPr>
-              <w:t>Formulario corto probado</w:t>
+              <w:t>Abandono de formulario reducido</w:t>
             </w:r>
           </w:p>
         </w:tc>
         <w:tc>
           <w:tcPr>
-            <w:tcW w:type="dxa" w:w="4873"/>
+            <w:tcW w:type="dxa" w:w="4320"/>
           </w:tcPr>
           <w:p>
-            <w:r/>
             <w:r>
-              <w:rPr>
-                <w:color w:val="1A1E17"/>
-                <w:sz w:val="20"/>
-              </w:rPr>
-              <w:t>Reporte de test A/B con al menos 2 semanas de datos</w:t>
+              <w:t>Tasa form_submit/form_start sobre el 43% actual.</w:t>
             </w:r>
           </w:p>
         </w:tc>
@@ -923,31 +495,21 @@
       <w:tr>
         <w:tc>
           <w:tcPr>
-            <w:tcW w:type="dxa" w:w="4873"/>
+            <w:tcW w:type="dxa" w:w="4320"/>
           </w:tcPr>
           <w:p>
-            <w:r/>
             <w:r>
-              <w:rPr>
-                <w:color w:val="1A1E17"/>
-                <w:sz w:val="20"/>
-              </w:rPr>
-              <w:t>Prueba social numérica</w:t>
+              <w:t>Formulario corto probado</w:t>
             </w:r>
           </w:p>
         </w:tc>
         <w:tc>
           <w:tcPr>
-            <w:tcW w:type="dxa" w:w="4873"/>
+            <w:tcW w:type="dxa" w:w="4320"/>
           </w:tcPr>
           <w:p>
-            <w:r/>
             <w:r>
-              <w:rPr>
-                <w:color w:val="1A1E17"/>
-                <w:sz w:val="20"/>
-              </w:rPr>
-              <w:t>Visible en la home sin necesidad de scroll adicional</w:t>
+              <w:t>Reporte de test A/B con al menos 2 semanas de datos.</w:t>
             </w:r>
           </w:p>
         </w:tc>
@@ -955,40 +517,51 @@
       <w:tr>
         <w:tc>
           <w:tcPr>
-            <w:tcW w:type="dxa" w:w="4873"/>
+            <w:tcW w:type="dxa" w:w="4320"/>
           </w:tcPr>
           <w:p>
-            <w:r/>
             <w:r>
-              <w:rPr>
-                <w:color w:val="1A1E17"/>
-                <w:sz w:val="20"/>
-              </w:rPr>
+              <w:t>Prueba social numérica</w:t>
+            </w:r>
+          </w:p>
+        </w:tc>
+        <w:tc>
+          <w:tcPr>
+            <w:tcW w:type="dxa" w:w="4320"/>
+          </w:tcPr>
+          <w:p>
+            <w:r>
+              <w:t>Visible en la home sin scroll adicional.</w:t>
+            </w:r>
+          </w:p>
+        </w:tc>
+      </w:tr>
+      <w:tr>
+        <w:tc>
+          <w:tcPr>
+            <w:tcW w:type="dxa" w:w="4320"/>
+          </w:tcPr>
+          <w:p>
+            <w:r>
               <w:t>Reporte de campañas</w:t>
             </w:r>
           </w:p>
         </w:tc>
         <w:tc>
           <w:tcPr>
-            <w:tcW w:type="dxa" w:w="4873"/>
+            <w:tcW w:type="dxa" w:w="4320"/>
           </w:tcPr>
           <w:p>
-            <w:r/>
             <w:r>
-              <w:rPr>
-                <w:color w:val="1A1E17"/>
-                <w:sz w:val="20"/>
-              </w:rPr>
-              <w:t>Entrega quincenal con las métricas indicadas</w:t>
+              <w:t>Entrega quincenal con las métricas indicadas.</w:t>
             </w:r>
           </w:p>
         </w:tc>
       </w:tr>
     </w:tbl>
-    <w:p/>
     <w:sectPr>
       <w:pgSz w:w="12240" w:h="15840"/>
-      <w:pgMar w:top="1134" w:right="1247" w:bottom="1134" w:left="1247" w:header="720" w:footer="720" w:gutter="0"/>
+      <w:pgMar w:top="1440" w:right="1800" w:bottom="1440" w:left="1800" w:header="720" w:footer="720" w:gutter="0"/>
       <w:cols w:space="720"/>
       <w:docGrid w:linePitch="360"/>
     </w:sectPr>
@@ -1359,11 +932,6 @@
     <w:name w:val="Normal"/>
     <w:qFormat/>
     <w:rsid w:val="00FC693F"/>
-    <w:rPr>
-      <w:rFonts w:ascii="Calibri" w:hAnsi="Calibri"/>
-      <w:color w:val="1A1E17"/>
-      <w:sz w:val="22"/>
-    </w:rPr>
   </w:style>
   <w:style w:type="paragraph" w:styleId="Header">
     <w:name w:val="header"/>

</xml_diff>